<commit_message>
Se dió más claridad al código
</commit_message>
<xml_diff>
--- a/TSOoficios/Documento recopilacion.docx
+++ b/TSOoficios/Documento recopilacion.docx
@@ -9,12 +9,6 @@
     </w:p>
     <w:p>
       <w:r>
-        <w:rPr>
-          <w:rFonts w:ascii="Segoe UI Emoji" w:hAnsi="Segoe UI Emoji" w:cs="Segoe UI Emoji"/>
-        </w:rPr>
-        <w:t>📦</w:t>
-      </w:r>
-      <w:r>
         <w:t xml:space="preserve"> Entregas realizadas (en orden original, hasta 480 minutos):</w:t>
       </w:r>
     </w:p>
@@ -309,35 +303,17 @@
     <w:p/>
     <w:p>
       <w:r>
-        <w:rPr>
-          <w:rFonts w:ascii="Segoe UI Symbol" w:hAnsi="Segoe UI Symbol" w:cs="Segoe UI Symbol"/>
-        </w:rPr>
-        <w:t>⏱</w:t>
-      </w:r>
-      <w:r>
         <w:t xml:space="preserve"> Tiempo total utilizado: 480.00 minutos</w:t>
       </w:r>
     </w:p>
     <w:p>
       <w:r>
-        <w:rPr>
-          <w:rFonts w:ascii="Segoe UI Emoji" w:hAnsi="Segoe UI Emoji" w:cs="Segoe UI Emoji"/>
-        </w:rPr>
-        <w:t>⭐</w:t>
-      </w:r>
-      <w:r>
         <w:t xml:space="preserve"> Prioridad total acumulada: 24</w:t>
       </w:r>
     </w:p>
     <w:p/>
     <w:p>
       <w:r>
-        <w:rPr>
-          <w:rFonts w:ascii="Segoe UI Emoji" w:hAnsi="Segoe UI Emoji" w:cs="Segoe UI Emoji"/>
-        </w:rPr>
-        <w:t>📊</w:t>
-      </w:r>
-      <w:r>
         <w:t xml:space="preserve"> Cantidad de entregas por prioridad:</w:t>
       </w:r>
     </w:p>
@@ -380,18 +356,12 @@
     <w:p/>
     <w:p>
       <w:r>
+        <w:t>Ruta con GRASP-INTERCAMBIO</w:t>
+      </w:r>
+    </w:p>
+    <w:p>
+      <w:r>
         <w:lastRenderedPageBreak/>
-        <w:t>Ruta con GRASP-INTERCAMBIO</w:t>
-      </w:r>
-    </w:p>
-    <w:p>
-      <w:r>
-        <w:rPr>
-          <w:rFonts w:ascii="Segoe UI Emoji" w:hAnsi="Segoe UI Emoji" w:cs="Segoe UI Emoji"/>
-        </w:rPr>
-        <w:t>📦</w:t>
-      </w:r>
-      <w:r>
         <w:t xml:space="preserve"> Ruta óptima encontrada:</w:t>
       </w:r>
     </w:p>
@@ -663,7 +633,390 @@
     </w:p>
     <w:p>
       <w:r>
+        <w:t xml:space="preserve">36        </w:t>
+      </w:r>
+      <w:proofErr w:type="gramStart"/>
+      <w:r>
+        <w:t>15:20:00  Av.</w:t>
+      </w:r>
+      <w:proofErr w:type="gramEnd"/>
+      <w:r>
+        <w:t xml:space="preserve"> Miguel Alemán No. 200, Col. La Fe, San </w:t>
+      </w:r>
+      <w:proofErr w:type="spellStart"/>
+      <w:r>
+        <w:t>Nic</w:t>
+      </w:r>
+      <w:proofErr w:type="spellEnd"/>
+      <w:r>
+        <w:t>...    Centro      Alta            30.0</w:t>
+      </w:r>
+    </w:p>
+    <w:p>
+      <w:r>
         <w:lastRenderedPageBreak/>
+        <w:t xml:space="preserve">42              </w:t>
+      </w:r>
+      <w:proofErr w:type="gramStart"/>
+      <w:r>
+        <w:t>NE  Calle</w:t>
+      </w:r>
+      <w:proofErr w:type="gramEnd"/>
+      <w:r>
+        <w:t xml:space="preserve"> La Estanzuela, Col. La Estanzuela, C.P. ...    Centro      Baja             0.0</w:t>
+      </w:r>
+    </w:p>
+    <w:p>
+      <w:r>
+        <w:t xml:space="preserve">44              </w:t>
+      </w:r>
+      <w:proofErr w:type="gramStart"/>
+      <w:r>
+        <w:t>NE  Calle</w:t>
+      </w:r>
+      <w:proofErr w:type="gramEnd"/>
+      <w:r>
+        <w:t xml:space="preserve"> San Luis Potosí 301, Col. </w:t>
+      </w:r>
+      <w:proofErr w:type="gramStart"/>
+      <w:r>
+        <w:t>Independencia,...</w:t>
+      </w:r>
+      <w:proofErr w:type="gramEnd"/>
+      <w:r>
+        <w:t xml:space="preserve">    Centro     Media            45.0</w:t>
+      </w:r>
+    </w:p>
+    <w:p/>
+    <w:p>
+      <w:r>
+        <w:t xml:space="preserve"> Tiempo total utilizado: 475.00 minutos</w:t>
+      </w:r>
+    </w:p>
+    <w:p>
+      <w:r>
+        <w:t xml:space="preserve"> Prioridad total acumulada: 34</w:t>
+      </w:r>
+    </w:p>
+    <w:p/>
+    <w:p>
+      <w:r>
+        <w:t xml:space="preserve"> Entregas por prioridad:</w:t>
+      </w:r>
+    </w:p>
+    <w:p>
+      <w:r>
+        <w:t xml:space="preserve"> Baja: 7</w:t>
+      </w:r>
+    </w:p>
+    <w:p>
+      <w:r>
+        <w:t xml:space="preserve"> Media: 2</w:t>
+      </w:r>
+    </w:p>
+    <w:p>
+      <w:r>
+        <w:t xml:space="preserve"> Alta: 4</w:t>
+      </w:r>
+    </w:p>
+    <w:p>
+      <w:r>
+        <w:t xml:space="preserve"> </w:t>
+      </w:r>
+      <w:proofErr w:type="gramStart"/>
+      <w:r>
+        <w:t>Total</w:t>
+      </w:r>
+      <w:proofErr w:type="gramEnd"/>
+      <w:r>
+        <w:t xml:space="preserve"> entregas: 18</w:t>
+      </w:r>
+    </w:p>
+    <w:p/>
+    <w:p/>
+    <w:p/>
+    <w:p/>
+    <w:p/>
+    <w:p>
+      <w:r>
+        <w:t>Ruta GRASP Localizado-Intercambio</w:t>
+      </w:r>
+    </w:p>
+    <w:p/>
+    <w:p>
+      <w:r>
+        <w:lastRenderedPageBreak/>
+        <w:t xml:space="preserve"> Ruta óptima encontrada:</w:t>
+      </w:r>
+    </w:p>
+    <w:p>
+      <w:r>
+        <w:t xml:space="preserve">   Hora de llegada                                          Dirección      Zona </w:t>
+      </w:r>
+      <w:proofErr w:type="gramStart"/>
+      <w:r>
+        <w:t xml:space="preserve">Prioridad  </w:t>
+      </w:r>
+      <w:proofErr w:type="spellStart"/>
+      <w:r>
+        <w:t>TiempoEstimado</w:t>
+      </w:r>
+      <w:proofErr w:type="spellEnd"/>
+      <w:proofErr w:type="gramEnd"/>
+    </w:p>
+    <w:p>
+      <w:r>
+        <w:t xml:space="preserve">20        </w:t>
+      </w:r>
+      <w:proofErr w:type="gramStart"/>
+      <w:r>
+        <w:t>08:00:00  Calle</w:t>
+      </w:r>
+      <w:proofErr w:type="gramEnd"/>
+      <w:r>
+        <w:t xml:space="preserve"> Avenida Aztlán SN-S"ESTACIONAMIENTO, Sin...  Poniente    INICIO            30.0</w:t>
+      </w:r>
+    </w:p>
+    <w:p>
+      <w:r>
+        <w:t xml:space="preserve">21        </w:t>
+      </w:r>
+      <w:proofErr w:type="gramStart"/>
+      <w:r>
+        <w:t>08:30:00  Calle</w:t>
+      </w:r>
+      <w:proofErr w:type="gramEnd"/>
+      <w:r>
+        <w:t xml:space="preserve"> Melchor Ocampo, Col. Centro, C.P. </w:t>
+      </w:r>
+      <w:proofErr w:type="gramStart"/>
+      <w:r>
+        <w:t>64000,...</w:t>
+      </w:r>
+      <w:proofErr w:type="gramEnd"/>
+      <w:r>
+        <w:t xml:space="preserve">    Centro      BAJA            30.0</w:t>
+      </w:r>
+    </w:p>
+    <w:p>
+      <w:r>
+        <w:t xml:space="preserve">22        </w:t>
+      </w:r>
+      <w:proofErr w:type="gramStart"/>
+      <w:r>
+        <w:t>09:00:00  Calle</w:t>
+      </w:r>
+      <w:proofErr w:type="gramEnd"/>
+      <w:r>
+        <w:t xml:space="preserve"> San Ángel, Col. San Ángel, C.P. 64770, M...    Centro      BAJA            40.0</w:t>
+      </w:r>
+    </w:p>
+    <w:p>
+      <w:r>
+        <w:t xml:space="preserve">23        </w:t>
+      </w:r>
+      <w:proofErr w:type="gramStart"/>
+      <w:r>
+        <w:t>09:40:00  Calle</w:t>
+      </w:r>
+      <w:proofErr w:type="gramEnd"/>
+      <w:r>
+        <w:t xml:space="preserve"> Junco de la Vega, Col. Roma, C.P. </w:t>
+      </w:r>
+      <w:proofErr w:type="gramStart"/>
+      <w:r>
+        <w:t>64700,...</w:t>
+      </w:r>
+      <w:proofErr w:type="gramEnd"/>
+      <w:r>
+        <w:t xml:space="preserve">    Centro      BAJA            40.0</w:t>
+      </w:r>
+    </w:p>
+    <w:p>
+      <w:r>
+        <w:t xml:space="preserve">24        </w:t>
+      </w:r>
+      <w:proofErr w:type="gramStart"/>
+      <w:r>
+        <w:t>09:40:00  Calle</w:t>
+      </w:r>
+      <w:proofErr w:type="gramEnd"/>
+      <w:r>
+        <w:t xml:space="preserve"> Junco de la Vega, Col. Roma, C.P. </w:t>
+      </w:r>
+      <w:proofErr w:type="gramStart"/>
+      <w:r>
+        <w:t>64700,...</w:t>
+      </w:r>
+      <w:proofErr w:type="gramEnd"/>
+      <w:r>
+        <w:t xml:space="preserve">    Centro      BAJA            40.0</w:t>
+      </w:r>
+    </w:p>
+    <w:p>
+      <w:r>
+        <w:t xml:space="preserve">25        </w:t>
+      </w:r>
+      <w:proofErr w:type="gramStart"/>
+      <w:r>
+        <w:t>10:20:00  Av.</w:t>
+      </w:r>
+      <w:proofErr w:type="gramEnd"/>
+      <w:r>
+        <w:t xml:space="preserve"> Paseo de los Leones, Col. Cumbres, C.P. 64...  Poniente      Baja            40.0</w:t>
+      </w:r>
+    </w:p>
+    <w:p>
+      <w:r>
+        <w:t xml:space="preserve">26        </w:t>
+      </w:r>
+      <w:proofErr w:type="gramStart"/>
+      <w:r>
+        <w:t>11:00:00  Calle</w:t>
+      </w:r>
+      <w:proofErr w:type="gramEnd"/>
+      <w:r>
+        <w:t xml:space="preserve"> Junco de la Vega, Col. Roma, C.P. </w:t>
+      </w:r>
+      <w:proofErr w:type="gramStart"/>
+      <w:r>
+        <w:t>64700,...</w:t>
+      </w:r>
+      <w:proofErr w:type="gramEnd"/>
+      <w:r>
+        <w:t xml:space="preserve">    Centro      Baja            25.0</w:t>
+      </w:r>
+    </w:p>
+    <w:p>
+      <w:r>
+        <w:t xml:space="preserve">27        </w:t>
+      </w:r>
+      <w:proofErr w:type="gramStart"/>
+      <w:r>
+        <w:t>11:25:00  Av.</w:t>
+      </w:r>
+      <w:proofErr w:type="gramEnd"/>
+      <w:r>
+        <w:t xml:space="preserve"> Miguel Alemán No. 200, Col. La Fe, San </w:t>
+      </w:r>
+      <w:proofErr w:type="spellStart"/>
+      <w:r>
+        <w:t>Nic</w:t>
+      </w:r>
+      <w:proofErr w:type="spellEnd"/>
+      <w:r>
+        <w:t>...    Centro      Alta            25.0</w:t>
+      </w:r>
+    </w:p>
+    <w:p>
+      <w:r>
+        <w:t xml:space="preserve">28        </w:t>
+      </w:r>
+      <w:proofErr w:type="gramStart"/>
+      <w:r>
+        <w:t>11:50:00  Calle</w:t>
+      </w:r>
+      <w:proofErr w:type="gramEnd"/>
+      <w:r>
+        <w:t xml:space="preserve"> Bernardo Reyes 510, Col. Infonavit Ricar...    Centro      Alta            30.0</w:t>
+      </w:r>
+    </w:p>
+    <w:p>
+      <w:r>
+        <w:t xml:space="preserve">29        </w:t>
+      </w:r>
+      <w:proofErr w:type="gramStart"/>
+      <w:r>
+        <w:t>12:20:00  Av.</w:t>
+      </w:r>
+      <w:proofErr w:type="gramEnd"/>
+      <w:r>
+        <w:t xml:space="preserve"> Lázaro Cárdenas No. 1817, Piso 1, Fracc. J...    Centro      Alta            20.0</w:t>
+      </w:r>
+    </w:p>
+    <w:p>
+      <w:r>
+        <w:t xml:space="preserve">30        </w:t>
+      </w:r>
+      <w:proofErr w:type="gramStart"/>
+      <w:r>
+        <w:t>12:40:00  Calle</w:t>
+      </w:r>
+      <w:proofErr w:type="gramEnd"/>
+      <w:r>
+        <w:t xml:space="preserve"> San Jerónimo, Col. San Jerónimo, C.P. 64...    Centro      Baja            20.0</w:t>
+      </w:r>
+    </w:p>
+    <w:p>
+      <w:r>
+        <w:t xml:space="preserve">31        </w:t>
+      </w:r>
+      <w:proofErr w:type="gramStart"/>
+      <w:r>
+        <w:t>13:00:00  Calle</w:t>
+      </w:r>
+      <w:proofErr w:type="gramEnd"/>
+      <w:r>
+        <w:t xml:space="preserve"> Valle de Infonavit, Col. Valle de </w:t>
+      </w:r>
+      <w:proofErr w:type="spellStart"/>
+      <w:r>
+        <w:t>Infona</w:t>
+      </w:r>
+      <w:proofErr w:type="spellEnd"/>
+      <w:r>
+        <w:t>...    Centro      Baja            20.0</w:t>
+      </w:r>
+    </w:p>
+    <w:p>
+      <w:r>
+        <w:t xml:space="preserve">32        </w:t>
+      </w:r>
+      <w:proofErr w:type="gramStart"/>
+      <w:r>
+        <w:t>13:20:00  Av.</w:t>
+      </w:r>
+      <w:proofErr w:type="gramEnd"/>
+      <w:r>
+        <w:t xml:space="preserve"> Aztlán, Col. San Bernabé 8º Sector, C.P. 6...     Norte      Baja            30.0</w:t>
+      </w:r>
+    </w:p>
+    <w:p>
+      <w:r>
+        <w:t xml:space="preserve">33        </w:t>
+      </w:r>
+      <w:proofErr w:type="gramStart"/>
+      <w:r>
+        <w:t>13:50:00  Av.</w:t>
+      </w:r>
+      <w:proofErr w:type="gramEnd"/>
+      <w:r>
+        <w:t xml:space="preserve"> Paseo de los Leones, Col. Cumbres, C.P. 64...  Poniente      Baja            70.0</w:t>
+      </w:r>
+    </w:p>
+    <w:p>
+      <w:r>
+        <w:t xml:space="preserve">35        </w:t>
+      </w:r>
+      <w:proofErr w:type="gramStart"/>
+      <w:r>
+        <w:t>15:00:00  Calle</w:t>
+      </w:r>
+      <w:proofErr w:type="gramEnd"/>
+      <w:r>
+        <w:t xml:space="preserve"> San Luis Potosí 301, Col. </w:t>
+      </w:r>
+      <w:proofErr w:type="gramStart"/>
+      <w:r>
+        <w:t>Independencia,...</w:t>
+      </w:r>
+      <w:proofErr w:type="gramEnd"/>
+      <w:r>
+        <w:t xml:space="preserve">    Centro     Media            20.0</w:t>
+      </w:r>
+    </w:p>
+    <w:p>
+      <w:r>
         <w:t xml:space="preserve">36        </w:t>
       </w:r>
       <w:proofErr w:type="gramStart"/>
@@ -685,57 +1038,38 @@
     </w:p>
     <w:p>
       <w:r>
-        <w:t xml:space="preserve">42              </w:t>
-      </w:r>
-      <w:proofErr w:type="gramStart"/>
-      <w:r>
-        <w:t>NE  Calle</w:t>
-      </w:r>
-      <w:proofErr w:type="gramEnd"/>
-      <w:r>
-        <w:t xml:space="preserve"> La Estanzuela, Col. La Estanzuela, C.P. ...    Centro      Baja             0.0</w:t>
-      </w:r>
-    </w:p>
-    <w:p>
-      <w:r>
-        <w:t xml:space="preserve">44              </w:t>
-      </w:r>
-      <w:proofErr w:type="gramStart"/>
-      <w:r>
-        <w:t>NE  Calle</w:t>
-      </w:r>
-      <w:proofErr w:type="gramEnd"/>
-      <w:r>
-        <w:t xml:space="preserve"> San Luis Potosí 301, Col. </w:t>
-      </w:r>
-      <w:proofErr w:type="gramStart"/>
-      <w:r>
-        <w:t>Independencia,...</w:t>
-      </w:r>
-      <w:proofErr w:type="gramEnd"/>
-      <w:r>
-        <w:t xml:space="preserve">    Centro     Media            45.0</w:t>
-      </w:r>
-    </w:p>
-    <w:p/>
-    <w:p>
-      <w:r>
-        <w:rPr>
-          <w:rFonts w:ascii="Segoe UI Symbol" w:hAnsi="Segoe UI Symbol" w:cs="Segoe UI Symbol"/>
-        </w:rPr>
-        <w:t>⏱</w:t>
-      </w:r>
-      <w:r>
-        <w:t xml:space="preserve"> Tiempo total utilizado: 475.00 minutos</w:t>
-      </w:r>
-    </w:p>
-    <w:p>
-      <w:r>
-        <w:rPr>
-          <w:rFonts w:ascii="Segoe UI Emoji" w:hAnsi="Segoe UI Emoji" w:cs="Segoe UI Emoji"/>
-        </w:rPr>
-        <w:t>⭐</w:t>
-      </w:r>
+        <w:lastRenderedPageBreak/>
+        <w:t xml:space="preserve">37        </w:t>
+      </w:r>
+      <w:proofErr w:type="gramStart"/>
+      <w:r>
+        <w:t>15:50:00  Calle</w:t>
+      </w:r>
+      <w:proofErr w:type="gramEnd"/>
+      <w:r>
+        <w:t xml:space="preserve"> Bernardo Reyes 510, Col. Infonavit Ricar...    Centro      Alta            35.0</w:t>
+      </w:r>
+    </w:p>
+    <w:p>
+      <w:r>
+        <w:t xml:space="preserve">38        </w:t>
+      </w:r>
+      <w:proofErr w:type="gramStart"/>
+      <w:r>
+        <w:t>16:25:00  Av.</w:t>
+      </w:r>
+      <w:proofErr w:type="gramEnd"/>
+      <w:r>
+        <w:t xml:space="preserve"> Lázaro Cárdenas No. 1817, Piso 1, Fracc. J...    Centro      Alta            35.0</w:t>
+      </w:r>
+    </w:p>
+    <w:p/>
+    <w:p>
+      <w:r>
+        <w:t xml:space="preserve"> Tiempo total utilizado: 480.00 minutos</w:t>
+      </w:r>
+    </w:p>
+    <w:p>
       <w:r>
         <w:t xml:space="preserve"> Prioridad total acumulada: 34</w:t>
       </w:r>
@@ -743,491 +1077,41 @@
     <w:p/>
     <w:p>
       <w:r>
-        <w:rPr>
-          <w:rFonts w:ascii="Segoe UI Emoji" w:hAnsi="Segoe UI Emoji" w:cs="Segoe UI Emoji"/>
-        </w:rPr>
-        <w:t>📊</w:t>
-      </w:r>
-      <w:r>
         <w:t xml:space="preserve"> Entregas por prioridad:</w:t>
       </w:r>
     </w:p>
     <w:p>
       <w:r>
-        <w:rPr>
-          <w:rFonts w:ascii="Segoe UI Emoji" w:hAnsi="Segoe UI Emoji" w:cs="Segoe UI Emoji"/>
-        </w:rPr>
-        <w:t>🔴</w:t>
-      </w:r>
-      <w:r>
-        <w:t xml:space="preserve"> Baja: 7</w:t>
-      </w:r>
-    </w:p>
-    <w:p>
-      <w:r>
-        <w:rPr>
-          <w:rFonts w:ascii="Segoe UI Emoji" w:hAnsi="Segoe UI Emoji" w:cs="Segoe UI Emoji"/>
-        </w:rPr>
-        <w:t>🟡</w:t>
-      </w:r>
-      <w:r>
-        <w:t xml:space="preserve"> Media: 2</w:t>
-      </w:r>
-    </w:p>
-    <w:p>
-      <w:r>
-        <w:rPr>
-          <w:rFonts w:ascii="Segoe UI Emoji" w:hAnsi="Segoe UI Emoji" w:cs="Segoe UI Emoji"/>
-        </w:rPr>
-        <w:t>🟢</w:t>
-      </w:r>
-      <w:r>
-        <w:t xml:space="preserve"> Alta: 4</w:t>
-      </w:r>
-    </w:p>
-    <w:p>
-      <w:r>
-        <w:rPr>
-          <w:rFonts w:ascii="Segoe UI Emoji" w:hAnsi="Segoe UI Emoji" w:cs="Segoe UI Emoji"/>
-        </w:rPr>
-        <w:t>📦</w:t>
-      </w:r>
-      <w:r>
-        <w:t xml:space="preserve"> Total entregas: 18</w:t>
-      </w:r>
-    </w:p>
-    <w:p/>
-    <w:p/>
-    <w:p/>
-    <w:p/>
-    <w:p/>
-    <w:p>
-      <w:r>
-        <w:lastRenderedPageBreak/>
-        <w:t>Ruta GRASP Localizado-Intercambio</w:t>
-      </w:r>
-    </w:p>
-    <w:p>
-      <w:pPr>
-        <w:rPr>
-          <w:lang w:val="en-US"/>
-        </w:rPr>
-      </w:pPr>
-    </w:p>
-    <w:p>
-      <w:r>
-        <w:rPr>
-          <w:rFonts w:ascii="Segoe UI Emoji" w:hAnsi="Segoe UI Emoji" w:cs="Segoe UI Emoji"/>
-        </w:rPr>
-        <w:t>📦</w:t>
-      </w:r>
-      <w:r>
-        <w:t xml:space="preserve"> Ruta óptima encontrada:</w:t>
-      </w:r>
-    </w:p>
-    <w:p>
-      <w:r>
-        <w:t xml:space="preserve">   Hora de llegada                                          Dirección      Zona </w:t>
-      </w:r>
-      <w:proofErr w:type="gramStart"/>
-      <w:r>
-        <w:t xml:space="preserve">Prioridad  </w:t>
-      </w:r>
-      <w:proofErr w:type="spellStart"/>
-      <w:r>
-        <w:t>TiempoEstimado</w:t>
-      </w:r>
-      <w:proofErr w:type="spellEnd"/>
-      <w:proofErr w:type="gramEnd"/>
-    </w:p>
-    <w:p>
-      <w:r>
-        <w:t xml:space="preserve">20        </w:t>
-      </w:r>
-      <w:proofErr w:type="gramStart"/>
-      <w:r>
-        <w:t>08:00:00  Calle</w:t>
-      </w:r>
-      <w:proofErr w:type="gramEnd"/>
-      <w:r>
-        <w:t xml:space="preserve"> Avenida Aztlán SN-S"ESTACIONAMIENTO, Sin...  Poniente    INICIO            30.0</w:t>
-      </w:r>
-    </w:p>
-    <w:p>
-      <w:r>
-        <w:t xml:space="preserve">21        </w:t>
-      </w:r>
-      <w:proofErr w:type="gramStart"/>
-      <w:r>
-        <w:t>08:30:00  Calle</w:t>
-      </w:r>
-      <w:proofErr w:type="gramEnd"/>
-      <w:r>
-        <w:t xml:space="preserve"> Melchor Ocampo, Col. Centro, C.P. </w:t>
-      </w:r>
-      <w:proofErr w:type="gramStart"/>
-      <w:r>
-        <w:t>64000,...</w:t>
-      </w:r>
-      <w:proofErr w:type="gramEnd"/>
-      <w:r>
-        <w:t xml:space="preserve">    Centro      BAJA            30.0</w:t>
-      </w:r>
-    </w:p>
-    <w:p>
-      <w:r>
-        <w:t xml:space="preserve">22        </w:t>
-      </w:r>
-      <w:proofErr w:type="gramStart"/>
-      <w:r>
-        <w:t>09:00:00  Calle</w:t>
-      </w:r>
-      <w:proofErr w:type="gramEnd"/>
-      <w:r>
-        <w:t xml:space="preserve"> San Ángel, Col. San Ángel, C.P. 64770, M...    Centro      BAJA            40.0</w:t>
-      </w:r>
-    </w:p>
-    <w:p>
-      <w:r>
-        <w:t xml:space="preserve">23        </w:t>
-      </w:r>
-      <w:proofErr w:type="gramStart"/>
-      <w:r>
-        <w:t>09:40:00  Calle</w:t>
-      </w:r>
-      <w:proofErr w:type="gramEnd"/>
-      <w:r>
-        <w:t xml:space="preserve"> Junco de la Vega, Col. Roma, C.P. </w:t>
-      </w:r>
-      <w:proofErr w:type="gramStart"/>
-      <w:r>
-        <w:t>64700,...</w:t>
-      </w:r>
-      <w:proofErr w:type="gramEnd"/>
-      <w:r>
-        <w:t xml:space="preserve">    Centro      BAJA            40.0</w:t>
-      </w:r>
-    </w:p>
-    <w:p>
-      <w:r>
-        <w:t xml:space="preserve">24        </w:t>
-      </w:r>
-      <w:proofErr w:type="gramStart"/>
-      <w:r>
-        <w:t>09:40:00  Calle</w:t>
-      </w:r>
-      <w:proofErr w:type="gramEnd"/>
-      <w:r>
-        <w:t xml:space="preserve"> Junco de la Vega, Col. Roma, C.P. </w:t>
-      </w:r>
-      <w:proofErr w:type="gramStart"/>
-      <w:r>
-        <w:t>64700,...</w:t>
-      </w:r>
-      <w:proofErr w:type="gramEnd"/>
-      <w:r>
-        <w:t xml:space="preserve">    Centro      BAJA            40.0</w:t>
-      </w:r>
-    </w:p>
-    <w:p>
-      <w:r>
-        <w:t xml:space="preserve">25        </w:t>
-      </w:r>
-      <w:proofErr w:type="gramStart"/>
-      <w:r>
-        <w:t>10:20:00  Av.</w:t>
-      </w:r>
-      <w:proofErr w:type="gramEnd"/>
-      <w:r>
-        <w:t xml:space="preserve"> Paseo de los Leones, Col. Cumbres, C.P. 64...  Poniente      Baja            40.0</w:t>
-      </w:r>
-    </w:p>
-    <w:p>
-      <w:r>
-        <w:t xml:space="preserve">26        </w:t>
-      </w:r>
-      <w:proofErr w:type="gramStart"/>
-      <w:r>
-        <w:t>11:00:00  Calle</w:t>
-      </w:r>
-      <w:proofErr w:type="gramEnd"/>
-      <w:r>
-        <w:t xml:space="preserve"> Junco de la Vega, Col. Roma, C.P. </w:t>
-      </w:r>
-      <w:proofErr w:type="gramStart"/>
-      <w:r>
-        <w:t>64700,...</w:t>
-      </w:r>
-      <w:proofErr w:type="gramEnd"/>
-      <w:r>
-        <w:t xml:space="preserve">    Centro      Baja            25.0</w:t>
-      </w:r>
-    </w:p>
-    <w:p>
-      <w:r>
-        <w:t xml:space="preserve">27        </w:t>
-      </w:r>
-      <w:proofErr w:type="gramStart"/>
-      <w:r>
-        <w:t>11:25:00  Av.</w:t>
-      </w:r>
-      <w:proofErr w:type="gramEnd"/>
-      <w:r>
-        <w:t xml:space="preserve"> Miguel Alemán No. 200, Col. La Fe, San </w:t>
-      </w:r>
-      <w:proofErr w:type="spellStart"/>
-      <w:r>
-        <w:t>Nic</w:t>
-      </w:r>
-      <w:proofErr w:type="spellEnd"/>
-      <w:r>
-        <w:t>...    Centro      Alta            25.0</w:t>
-      </w:r>
-    </w:p>
-    <w:p>
-      <w:r>
-        <w:t xml:space="preserve">28        </w:t>
-      </w:r>
-      <w:proofErr w:type="gramStart"/>
-      <w:r>
-        <w:t>11:50:00  Calle</w:t>
-      </w:r>
-      <w:proofErr w:type="gramEnd"/>
-      <w:r>
-        <w:t xml:space="preserve"> Bernardo Reyes 510, Col. Infonavit Ricar...    Centro      Alta            30.0</w:t>
-      </w:r>
-    </w:p>
-    <w:p>
-      <w:r>
-        <w:t xml:space="preserve">29        </w:t>
-      </w:r>
-      <w:proofErr w:type="gramStart"/>
-      <w:r>
-        <w:t>12:20:00  Av.</w:t>
-      </w:r>
-      <w:proofErr w:type="gramEnd"/>
-      <w:r>
-        <w:t xml:space="preserve"> Lázaro Cárdenas No. 1817, Piso 1, Fracc. J...    Centro      Alta            20.0</w:t>
-      </w:r>
-    </w:p>
-    <w:p>
-      <w:r>
-        <w:t xml:space="preserve">30        </w:t>
-      </w:r>
-      <w:proofErr w:type="gramStart"/>
-      <w:r>
-        <w:t>12:40:00  Calle</w:t>
-      </w:r>
-      <w:proofErr w:type="gramEnd"/>
-      <w:r>
-        <w:t xml:space="preserve"> San Jerónimo, Col. San Jerónimo, C.P. 64...    Centro      Baja            20.0</w:t>
-      </w:r>
-    </w:p>
-    <w:p>
-      <w:r>
-        <w:t xml:space="preserve">31        </w:t>
-      </w:r>
-      <w:proofErr w:type="gramStart"/>
-      <w:r>
-        <w:t>13:00:00  Calle</w:t>
-      </w:r>
-      <w:proofErr w:type="gramEnd"/>
-      <w:r>
-        <w:t xml:space="preserve"> Valle de Infonavit, Col. Valle de </w:t>
-      </w:r>
-      <w:proofErr w:type="spellStart"/>
-      <w:r>
-        <w:t>Infona</w:t>
-      </w:r>
-      <w:proofErr w:type="spellEnd"/>
-      <w:r>
-        <w:t>...    Centro      Baja            20.0</w:t>
-      </w:r>
-    </w:p>
-    <w:p>
-      <w:r>
-        <w:t xml:space="preserve">32        </w:t>
-      </w:r>
-      <w:proofErr w:type="gramStart"/>
-      <w:r>
-        <w:t>13:20:00  Av.</w:t>
-      </w:r>
-      <w:proofErr w:type="gramEnd"/>
-      <w:r>
-        <w:t xml:space="preserve"> Aztlán, Col. San Bernabé 8º Sector, C.P. 6...     Norte      Baja            30.0</w:t>
-      </w:r>
-    </w:p>
-    <w:p>
-      <w:r>
-        <w:t xml:space="preserve">33        </w:t>
-      </w:r>
-      <w:proofErr w:type="gramStart"/>
-      <w:r>
-        <w:t>13:50:00  Av.</w:t>
-      </w:r>
-      <w:proofErr w:type="gramEnd"/>
-      <w:r>
-        <w:t xml:space="preserve"> Paseo de los Leones, Col. Cumbres, C.P. 64...  Poniente      Baja            70.0</w:t>
-      </w:r>
-    </w:p>
-    <w:p>
-      <w:r>
-        <w:lastRenderedPageBreak/>
-        <w:t xml:space="preserve">35        </w:t>
-      </w:r>
-      <w:proofErr w:type="gramStart"/>
-      <w:r>
-        <w:t>15:00:00  Calle</w:t>
-      </w:r>
-      <w:proofErr w:type="gramEnd"/>
-      <w:r>
-        <w:t xml:space="preserve"> San Luis Potosí 301, Col. </w:t>
-      </w:r>
-      <w:proofErr w:type="gramStart"/>
-      <w:r>
-        <w:t>Independencia,...</w:t>
-      </w:r>
-      <w:proofErr w:type="gramEnd"/>
-      <w:r>
-        <w:t xml:space="preserve">    Centro     Media            20.0</w:t>
-      </w:r>
-    </w:p>
-    <w:p>
-      <w:r>
-        <w:t xml:space="preserve">36        </w:t>
-      </w:r>
-      <w:proofErr w:type="gramStart"/>
-      <w:r>
-        <w:t>15:20:00  Av.</w:t>
-      </w:r>
-      <w:proofErr w:type="gramEnd"/>
-      <w:r>
-        <w:t xml:space="preserve"> Miguel Alemán No. 200, Col. La Fe, San </w:t>
-      </w:r>
-      <w:proofErr w:type="spellStart"/>
-      <w:r>
-        <w:t>Nic</w:t>
-      </w:r>
-      <w:proofErr w:type="spellEnd"/>
-      <w:r>
-        <w:t>...    Centro      Alta            30.0</w:t>
-      </w:r>
-    </w:p>
-    <w:p>
-      <w:r>
-        <w:t xml:space="preserve">37        </w:t>
-      </w:r>
-      <w:proofErr w:type="gramStart"/>
-      <w:r>
-        <w:t>15:50:00  Calle</w:t>
-      </w:r>
-      <w:proofErr w:type="gramEnd"/>
-      <w:r>
-        <w:t xml:space="preserve"> Bernardo Reyes 510, Col. Infonavit Ricar...    Centro      Alta            35.0</w:t>
-      </w:r>
-    </w:p>
-    <w:p>
-      <w:r>
-        <w:t xml:space="preserve">38        </w:t>
-      </w:r>
-      <w:proofErr w:type="gramStart"/>
-      <w:r>
-        <w:t>16:25:00  Av.</w:t>
-      </w:r>
-      <w:proofErr w:type="gramEnd"/>
-      <w:r>
-        <w:t xml:space="preserve"> Lázaro Cárdenas No. 1817, Piso 1, Fracc. J...    Centro      Alta            35.0</w:t>
-      </w:r>
-    </w:p>
-    <w:p/>
-    <w:p>
-      <w:r>
-        <w:rPr>
-          <w:rFonts w:ascii="Segoe UI Symbol" w:hAnsi="Segoe UI Symbol" w:cs="Segoe UI Symbol"/>
-        </w:rPr>
-        <w:t>⏱</w:t>
-      </w:r>
-      <w:r>
-        <w:t xml:space="preserve"> Tiempo total utilizado: 480.00 minutos</w:t>
-      </w:r>
-    </w:p>
-    <w:p>
-      <w:r>
-        <w:rPr>
-          <w:rFonts w:ascii="Segoe UI Emoji" w:hAnsi="Segoe UI Emoji" w:cs="Segoe UI Emoji"/>
-        </w:rPr>
-        <w:t>⭐</w:t>
-      </w:r>
-      <w:r>
-        <w:t xml:space="preserve"> Prioridad total acumulada: 34</w:t>
-      </w:r>
-    </w:p>
-    <w:p/>
-    <w:p>
-      <w:r>
-        <w:rPr>
-          <w:rFonts w:ascii="Segoe UI Emoji" w:hAnsi="Segoe UI Emoji" w:cs="Segoe UI Emoji"/>
-        </w:rPr>
-        <w:t>📊</w:t>
-      </w:r>
-      <w:r>
-        <w:t xml:space="preserve"> Entregas por prioridad:</w:t>
-      </w:r>
-    </w:p>
-    <w:p>
-      <w:r>
-        <w:rPr>
-          <w:rFonts w:ascii="Segoe UI Emoji" w:hAnsi="Segoe UI Emoji" w:cs="Segoe UI Emoji"/>
-        </w:rPr>
-        <w:t>🔴</w:t>
-      </w:r>
-      <w:r>
         <w:t xml:space="preserve"> Baja: 6</w:t>
       </w:r>
     </w:p>
     <w:p>
       <w:r>
-        <w:rPr>
-          <w:rFonts w:ascii="Segoe UI Emoji" w:hAnsi="Segoe UI Emoji" w:cs="Segoe UI Emoji"/>
-        </w:rPr>
-        <w:t>🟡</w:t>
-      </w:r>
-      <w:r>
-        <w:t xml:space="preserve"> Media: 1</w:t>
-      </w:r>
-    </w:p>
-    <w:p>
-      <w:r>
-        <w:rPr>
-          <w:rFonts w:ascii="Segoe UI Emoji" w:hAnsi="Segoe UI Emoji" w:cs="Segoe UI Emoji"/>
-        </w:rPr>
-        <w:t>🟢</w:t>
-      </w:r>
+        <w:t>Media: 1</w:t>
+      </w:r>
+    </w:p>
+    <w:p>
       <w:r>
         <w:t xml:space="preserve"> Alta: 6</w:t>
       </w:r>
     </w:p>
     <w:p>
       <w:r>
-        <w:rPr>
-          <w:rFonts w:ascii="Segoe UI Emoji" w:hAnsi="Segoe UI Emoji" w:cs="Segoe UI Emoji"/>
-        </w:rPr>
-        <w:t>📦</w:t>
-      </w:r>
-      <w:r>
-        <w:t xml:space="preserve"> Total entregas: 18</w:t>
-      </w:r>
-    </w:p>
-    <w:p/>
-    <w:p>
-      <w:r>
-        <w:rPr>
-          <w:rFonts w:ascii="Segoe UI Emoji" w:hAnsi="Segoe UI Emoji" w:cs="Segoe UI Emoji"/>
-        </w:rPr>
-        <w:t>📈</w:t>
-      </w:r>
-      <w:r>
-        <w:t xml:space="preserve"> % de entregas de alta prioridad realizadas: 100.00% de 6</w:t>
+        <w:t xml:space="preserve"> </w:t>
+      </w:r>
+      <w:proofErr w:type="gramStart"/>
+      <w:r>
+        <w:t>Total</w:t>
+      </w:r>
+      <w:proofErr w:type="gramEnd"/>
+      <w:r>
+        <w:t xml:space="preserve"> entregas: 18</w:t>
+      </w:r>
+    </w:p>
+    <w:p/>
+    <w:p>
+      <w:r>
+        <w:t>% de entregas de alta prioridad realizadas: 100.00% de 6</w:t>
       </w:r>
     </w:p>
     <w:p/>
@@ -1251,6 +1135,7 @@
     <w:p/>
     <w:tbl>
       <w:tblPr>
+        <w:tblpPr w:leftFromText="141" w:rightFromText="141" w:horzAnchor="margin" w:tblpY="-9440"/>
         <w:tblW w:w="2400" w:type="dxa"/>
         <w:tblCellMar>
           <w:left w:w="70" w:type="dxa"/>
@@ -1280,6 +1165,48 @@
             <w:vAlign w:val="bottom"/>
             <w:hideMark/>
           </w:tcPr>
+          <w:p>
+            <w:pPr>
+              <w:spacing w:after="0" w:line="240" w:lineRule="auto"/>
+              <w:rPr>
+                <w:rFonts w:ascii="Calibri" w:eastAsia="Times New Roman" w:hAnsi="Calibri" w:cs="Calibri"/>
+                <w:color w:val="000000"/>
+                <w:kern w:val="0"/>
+                <w:sz w:val="22"/>
+                <w:szCs w:val="22"/>
+                <w:lang w:eastAsia="es-MX"/>
+                <w14:ligatures w14:val="none"/>
+              </w:rPr>
+            </w:pPr>
+          </w:p>
+          <w:p>
+            <w:pPr>
+              <w:spacing w:after="0" w:line="240" w:lineRule="auto"/>
+              <w:rPr>
+                <w:rFonts w:ascii="Calibri" w:eastAsia="Times New Roman" w:hAnsi="Calibri" w:cs="Calibri"/>
+                <w:color w:val="000000"/>
+                <w:kern w:val="0"/>
+                <w:sz w:val="22"/>
+                <w:szCs w:val="22"/>
+                <w:lang w:eastAsia="es-MX"/>
+                <w14:ligatures w14:val="none"/>
+              </w:rPr>
+            </w:pPr>
+          </w:p>
+          <w:p>
+            <w:pPr>
+              <w:spacing w:after="0" w:line="240" w:lineRule="auto"/>
+              <w:rPr>
+                <w:rFonts w:ascii="Calibri" w:eastAsia="Times New Roman" w:hAnsi="Calibri" w:cs="Calibri"/>
+                <w:color w:val="000000"/>
+                <w:kern w:val="0"/>
+                <w:sz w:val="22"/>
+                <w:szCs w:val="22"/>
+                <w:lang w:eastAsia="es-MX"/>
+                <w14:ligatures w14:val="none"/>
+              </w:rPr>
+            </w:pPr>
+          </w:p>
           <w:p>
             <w:pPr>
               <w:spacing w:after="0" w:line="240" w:lineRule="auto"/>
@@ -1391,7 +1318,6 @@
                 <w:lang w:eastAsia="es-MX"/>
                 <w14:ligatures w14:val="none"/>
               </w:rPr>
-              <w:lastRenderedPageBreak/>
               <w:t>media</w:t>
             </w:r>
           </w:p>
@@ -1652,35 +1578,17 @@
     </w:p>
     <w:p>
       <w:r>
-        <w:rPr>
-          <w:rFonts w:ascii="Segoe UI Symbol" w:hAnsi="Segoe UI Symbol" w:cs="Segoe UI Symbol"/>
-        </w:rPr>
-        <w:t>⏱</w:t>
-      </w:r>
-      <w:r>
         <w:t xml:space="preserve"> Tiempo total utilizado: 480.00 minutos</w:t>
       </w:r>
     </w:p>
     <w:p>
       <w:r>
-        <w:rPr>
-          <w:rFonts w:ascii="Segoe UI Emoji" w:hAnsi="Segoe UI Emoji" w:cs="Segoe UI Emoji"/>
-        </w:rPr>
-        <w:t>⭐</w:t>
-      </w:r>
-      <w:r>
         <w:t xml:space="preserve"> Prioridad total acumulada: 24</w:t>
       </w:r>
     </w:p>
     <w:p/>
     <w:p>
       <w:r>
-        <w:rPr>
-          <w:rFonts w:ascii="Segoe UI Emoji" w:hAnsi="Segoe UI Emoji" w:cs="Segoe UI Emoji"/>
-        </w:rPr>
-        <w:t>📊</w:t>
-      </w:r>
-      <w:r>
         <w:t xml:space="preserve"> Cantidad de entregas por prioridad:</w:t>
       </w:r>
     </w:p>
@@ -1722,81 +1630,47 @@
     </w:p>
     <w:p>
       <w:r>
-        <w:rPr>
-          <w:rFonts w:ascii="Segoe UI Symbol" w:hAnsi="Segoe UI Symbol" w:cs="Segoe UI Symbol"/>
-        </w:rPr>
-        <w:t>⏱</w:t>
-      </w:r>
-      <w:r>
         <w:t xml:space="preserve"> Tiempo total utilizado: 475.00 minutos</w:t>
       </w:r>
     </w:p>
     <w:p>
       <w:r>
-        <w:rPr>
-          <w:rFonts w:ascii="Segoe UI Emoji" w:hAnsi="Segoe UI Emoji" w:cs="Segoe UI Emoji"/>
-        </w:rPr>
+        <w:t xml:space="preserve"> Prioridad total acumulada: 34</w:t>
+      </w:r>
+    </w:p>
+    <w:p/>
+    <w:p>
+      <w:r>
         <w:lastRenderedPageBreak/>
-        <w:t>⭐</w:t>
-      </w:r>
-      <w:r>
-        <w:t xml:space="preserve"> Prioridad total acumulada: 34</w:t>
-      </w:r>
-    </w:p>
-    <w:p/>
-    <w:p>
-      <w:r>
-        <w:rPr>
-          <w:rFonts w:ascii="Segoe UI Emoji" w:hAnsi="Segoe UI Emoji" w:cs="Segoe UI Emoji"/>
-        </w:rPr>
-        <w:t>📊</w:t>
-      </w:r>
-      <w:r>
         <w:t xml:space="preserve"> Entregas por prioridad:</w:t>
       </w:r>
     </w:p>
     <w:p>
       <w:r>
-        <w:rPr>
-          <w:rFonts w:ascii="Segoe UI Emoji" w:hAnsi="Segoe UI Emoji" w:cs="Segoe UI Emoji"/>
-        </w:rPr>
-        <w:t>🔴</w:t>
-      </w:r>
-      <w:r>
         <w:t xml:space="preserve"> Baja: 7</w:t>
       </w:r>
     </w:p>
     <w:p>
       <w:r>
-        <w:rPr>
-          <w:rFonts w:ascii="Segoe UI Emoji" w:hAnsi="Segoe UI Emoji" w:cs="Segoe UI Emoji"/>
-        </w:rPr>
-        <w:t>🟡</w:t>
-      </w:r>
-      <w:r>
         <w:t xml:space="preserve"> Media: 2</w:t>
       </w:r>
     </w:p>
     <w:p>
       <w:r>
-        <w:rPr>
-          <w:rFonts w:ascii="Segoe UI Emoji" w:hAnsi="Segoe UI Emoji" w:cs="Segoe UI Emoji"/>
-        </w:rPr>
-        <w:t>🟢</w:t>
-      </w:r>
-      <w:r>
         <w:t xml:space="preserve"> Alta: 4</w:t>
       </w:r>
     </w:p>
     <w:p>
       <w:r>
-        <w:rPr>
-          <w:rFonts w:ascii="Segoe UI Emoji" w:hAnsi="Segoe UI Emoji" w:cs="Segoe UI Emoji"/>
-        </w:rPr>
-        <w:t>📦</w:t>
-      </w:r>
-      <w:r>
-        <w:t xml:space="preserve"> Total entregas: 18</w:t>
+        <w:t xml:space="preserve"> </w:t>
+      </w:r>
+      <w:proofErr w:type="gramStart"/>
+      <w:r>
+        <w:t>Total</w:t>
+      </w:r>
+      <w:proofErr w:type="gramEnd"/>
+      <w:r>
+        <w:t xml:space="preserve"> entregas: 18</w:t>
       </w:r>
     </w:p>
     <w:p>
@@ -1822,92 +1696,52 @@
     <w:p/>
     <w:p>
       <w:r>
-        <w:rPr>
-          <w:rFonts w:ascii="Segoe UI Symbol" w:hAnsi="Segoe UI Symbol" w:cs="Segoe UI Symbol"/>
-        </w:rPr>
-        <w:t>⏱</w:t>
-      </w:r>
-      <w:r>
         <w:t xml:space="preserve"> Tiempo total utilizado: 480.00 minutos</w:t>
       </w:r>
     </w:p>
     <w:p>
       <w:r>
-        <w:rPr>
-          <w:rFonts w:ascii="Segoe UI Emoji" w:hAnsi="Segoe UI Emoji" w:cs="Segoe UI Emoji"/>
-        </w:rPr>
-        <w:t>⭐</w:t>
-      </w:r>
-      <w:r>
         <w:t xml:space="preserve"> Prioridad total acumulada: 34</w:t>
       </w:r>
     </w:p>
     <w:p/>
     <w:p>
       <w:r>
-        <w:rPr>
-          <w:rFonts w:ascii="Segoe UI Emoji" w:hAnsi="Segoe UI Emoji" w:cs="Segoe UI Emoji"/>
-        </w:rPr>
-        <w:t>📊</w:t>
-      </w:r>
-      <w:r>
-        <w:t xml:space="preserve"> Entregas por prioridad:</w:t>
-      </w:r>
-    </w:p>
-    <w:p>
-      <w:r>
-        <w:rPr>
-          <w:rFonts w:ascii="Segoe UI Emoji" w:hAnsi="Segoe UI Emoji" w:cs="Segoe UI Emoji"/>
-        </w:rPr>
-        <w:t>🔴</w:t>
-      </w:r>
+        <w:t>Entregas por prioridad:</w:t>
+      </w:r>
+    </w:p>
+    <w:p>
       <w:r>
         <w:t xml:space="preserve"> Baja: 6</w:t>
       </w:r>
     </w:p>
     <w:p>
       <w:r>
-        <w:rPr>
-          <w:rFonts w:ascii="Segoe UI Emoji" w:hAnsi="Segoe UI Emoji" w:cs="Segoe UI Emoji"/>
-        </w:rPr>
-        <w:t>🟡</w:t>
-      </w:r>
-      <w:r>
         <w:t xml:space="preserve"> Media: 1</w:t>
       </w:r>
     </w:p>
     <w:p>
       <w:r>
-        <w:rPr>
-          <w:rFonts w:ascii="Segoe UI Emoji" w:hAnsi="Segoe UI Emoji" w:cs="Segoe UI Emoji"/>
-        </w:rPr>
-        <w:t>🟢</w:t>
-      </w:r>
-      <w:r>
         <w:t xml:space="preserve"> Alta: 6</w:t>
       </w:r>
     </w:p>
     <w:p>
       <w:r>
-        <w:rPr>
-          <w:rFonts w:ascii="Segoe UI Emoji" w:hAnsi="Segoe UI Emoji" w:cs="Segoe UI Emoji"/>
-        </w:rPr>
+        <w:t xml:space="preserve"> </w:t>
+      </w:r>
+      <w:proofErr w:type="gramStart"/>
+      <w:r>
+        <w:t>Total</w:t>
+      </w:r>
+      <w:proofErr w:type="gramEnd"/>
+      <w:r>
+        <w:t xml:space="preserve"> entregas: 18</w:t>
+      </w:r>
+    </w:p>
+    <w:p/>
+    <w:p>
+      <w:r>
         <w:lastRenderedPageBreak/>
-        <w:t>📦</w:t>
-      </w:r>
-      <w:r>
-        <w:t xml:space="preserve"> Total entregas: 18</w:t>
-      </w:r>
-    </w:p>
-    <w:p/>
-    <w:p>
-      <w:r>
-        <w:rPr>
-          <w:rFonts w:ascii="Segoe UI Emoji" w:hAnsi="Segoe UI Emoji" w:cs="Segoe UI Emoji"/>
-        </w:rPr>
-        <w:t>📈</w:t>
-      </w:r>
-      <w:r>
         <w:t xml:space="preserve"> % de entregas de alta prioridad realizadas: 100.00% de 6</w:t>
       </w:r>
     </w:p>

</xml_diff>